<commit_message>
feat: replace Gmail compose with EmailJS auto-send
</commit_message>
<xml_diff>
--- a/public/CV_NorvisYunior.docx
+++ b/public/CV_NorvisYunior.docx
@@ -1,6 +1,6 @@
 
 <file path=word/document.xml><?xml version="1.0" encoding="utf-8"?>
-<w:document xmlns:wpc="http://schemas.microsoft.com/office/word/2010/wordprocessingCanvas" xmlns:cx="http://schemas.microsoft.com/office/drawing/2014/chartex" xmlns:cx1="http://schemas.microsoft.com/office/drawing/2015/9/8/chartex" xmlns:cx2="http://schemas.microsoft.com/office/drawing/2015/10/21/chartex" xmlns:cx3="http://schemas.microsoft.com/office/drawing/2016/5/9/chartex" xmlns:cx4="http://schemas.microsoft.com/office/drawing/2016/5/10/chartex" xmlns:cx5="http://schemas.microsoft.com/office/drawing/2016/5/11/chartex" xmlns:cx6="http://schemas.microsoft.com/office/drawing/2016/5/12/chartex" xmlns:cx7="http://schemas.microsoft.com/office/drawing/2016/5/13/chartex" xmlns:cx8="http://schemas.microsoft.com/office/drawing/2016/5/14/chartex" xmlns:mc="http://schemas.openxmlformats.org/markup-compatibility/2006" xmlns:aink="http://schemas.microsoft.com/office/drawing/2016/ink" xmlns:am3d="http://schemas.microsoft.com/office/drawing/2017/model3d" xmlns:o="urn:schemas-microsoft-com:office:office" xmlns:oel="http://schemas.microsoft.com/office/2019/extlst" xmlns:r="http://schemas.openxmlformats.org/officeDocument/2006/relationships" xmlns:m="http://schemas.openxmlformats.org/officeDocument/2006/math" xmlns:v="urn:schemas-microsoft-com:vml" xmlns:wp14="http://schemas.microsoft.com/office/word/2010/wordprocessingDrawing" xmlns:wp="http://schemas.openxmlformats.org/drawingml/2006/wordprocessingDrawing" xmlns:w10="urn:schemas-microsoft-com:office:word" xmlns:w="http://schemas.openxmlformats.org/wordprocessingml/2006/main" xmlns:w14="http://schemas.microsoft.com/office/word/2010/wordml" xmlns:w15="http://schemas.microsoft.com/office/word/2012/wordml" xmlns:w16cex="http://schemas.microsoft.com/office/word/2018/wordml/cex" xmlns:w16cid="http://schemas.microsoft.com/office/word/2016/wordml/cid" xmlns:w16="http://schemas.microsoft.com/office/word/2018/wordml" xmlns:w16du="http://schemas.microsoft.com/office/word/2023/wordml/word16du" xmlns:w16sdtdh="http://schemas.microsoft.com/office/word/2020/wordml/sdtdatahash" xmlns:w16se="http://schemas.microsoft.com/office/word/2015/wordml/symex" xmlns:wpg="http://schemas.microsoft.com/office/word/2010/wordprocessingGroup" xmlns:wpi="http://schemas.microsoft.com/office/word/2010/wordprocessingInk" xmlns:wne="http://schemas.microsoft.com/office/word/2006/wordml" xmlns:wps="http://schemas.microsoft.com/office/word/2010/wordprocessingShape" mc:Ignorable="w14 w15 w16se w16cid w16 w16cex w16sdtdh w16du wp14">
+<w:document xmlns:wpc="http://schemas.microsoft.com/office/word/2010/wordprocessingCanvas" xmlns:cx="http://schemas.microsoft.com/office/drawing/2014/chartex" xmlns:cx1="http://schemas.microsoft.com/office/drawing/2015/9/8/chartex" xmlns:cx2="http://schemas.microsoft.com/office/drawing/2015/10/21/chartex" xmlns:cx3="http://schemas.microsoft.com/office/drawing/2016/5/9/chartex" xmlns:cx4="http://schemas.microsoft.com/office/drawing/2016/5/10/chartex" xmlns:cx5="http://schemas.microsoft.com/office/drawing/2016/5/11/chartex" xmlns:cx6="http://schemas.microsoft.com/office/drawing/2016/5/12/chartex" xmlns:cx7="http://schemas.microsoft.com/office/drawing/2016/5/13/chartex" xmlns:cx8="http://schemas.microsoft.com/office/drawing/2016/5/14/chartex" xmlns:mc="http://schemas.openxmlformats.org/markup-compatibility/2006" xmlns:aink="http://schemas.microsoft.com/office/drawing/2016/ink" xmlns:am3d="http://schemas.microsoft.com/office/drawing/2017/model3d" xmlns:o="urn:schemas-microsoft-com:office:office" xmlns:oel="http://schemas.microsoft.com/office/2019/extlst" xmlns:r="http://schemas.openxmlformats.org/officeDocument/2006/relationships" xmlns:m="http://schemas.openxmlformats.org/officeDocument/2006/math" xmlns:v="urn:schemas-microsoft-com:vml" xmlns:wp14="http://schemas.microsoft.com/office/word/2010/wordprocessingDrawing" xmlns:wp="http://schemas.openxmlformats.org/drawingml/2006/wordprocessingDrawing" xmlns:w10="urn:schemas-microsoft-com:office:word" xmlns:w="http://schemas.openxmlformats.org/wordprocessingml/2006/main" xmlns:w14="http://schemas.microsoft.com/office/word/2010/wordml" xmlns:w15="http://schemas.microsoft.com/office/word/2012/wordml" xmlns:w16cei="http://schemas.microsoft.com/office/word/2026/wordml/cei" xmlns:w16cex="http://schemas.microsoft.com/office/word/2018/wordml/cex" xmlns:w16cid="http://schemas.microsoft.com/office/word/2016/wordml/cid" xmlns:w16="http://schemas.microsoft.com/office/word/2018/wordml" xmlns:w16du="http://schemas.microsoft.com/office/word/2023/wordml/word16du" xmlns:w16sdtdh="http://schemas.microsoft.com/office/word/2020/wordml/sdtdatahash" xmlns:w16sdtfl="http://schemas.microsoft.com/office/word/2024/wordml/sdtformatlock" xmlns:w16se="http://schemas.microsoft.com/office/word/2015/wordml/symex" xmlns:wpg="http://schemas.microsoft.com/office/word/2010/wordprocessingGroup" xmlns:wpi="http://schemas.microsoft.com/office/word/2010/wordprocessingInk" xmlns:wne="http://schemas.microsoft.com/office/word/2006/wordml" xmlns:wps="http://schemas.microsoft.com/office/word/2010/wordprocessingShape" mc:Ignorable="w14 w15 w16se w16cid w16 w16cex w16sdtdh w16sdtfl w16du wp14">
   <w:body>
     <w:tbl>
       <w:tblPr>
@@ -129,7 +129,31 @@
                   <w:lang w:eastAsia="es-ES"/>
                   <w14:ligatures w14:val="none"/>
                 </w:rPr>
-                <w:t>Portfolio</w:t>
+                <w:t>Portf</w:t>
+              </w:r>
+              <w:r>
+                <w:rPr>
+                  <w:rStyle w:val="Hyperlink"/>
+                  <w:rFonts w:eastAsia="Times New Roman" w:cs="Times New Roman"/>
+                  <w:kern w:val="0"/>
+                  <w:sz w:val="22"/>
+                  <w:szCs w:val="22"/>
+                  <w:lang w:eastAsia="es-ES"/>
+                  <w14:ligatures w14:val="none"/>
+                </w:rPr>
+                <w:t>o</w:t>
+              </w:r>
+              <w:r>
+                <w:rPr>
+                  <w:rStyle w:val="Hyperlink"/>
+                  <w:rFonts w:eastAsia="Times New Roman" w:cs="Times New Roman"/>
+                  <w:kern w:val="0"/>
+                  <w:sz w:val="22"/>
+                  <w:szCs w:val="22"/>
+                  <w:lang w:eastAsia="es-ES"/>
+                  <w14:ligatures w14:val="none"/>
+                </w:rPr>
+                <w:t>lio</w:t>
               </w:r>
             </w:hyperlink>
             <w:r>
@@ -167,67 +191,7 @@
                   <w:lang w:eastAsia="es-ES"/>
                   <w14:ligatures w14:val="none"/>
                 </w:rPr>
-                <w:t>norviscabr</w:t>
-              </w:r>
-              <w:r>
-                <w:rPr>
-                  <w:rStyle w:val="Hyperlink"/>
-                  <w:rFonts w:eastAsia="Times New Roman" w:cs="Times New Roman"/>
-                  <w:kern w:val="0"/>
-                  <w:sz w:val="22"/>
-                  <w:szCs w:val="22"/>
-                  <w:lang w:eastAsia="es-ES"/>
-                  <w14:ligatures w14:val="none"/>
-                </w:rPr>
-                <w:t>e</w:t>
-              </w:r>
-              <w:r>
-                <w:rPr>
-                  <w:rStyle w:val="Hyperlink"/>
-                  <w:rFonts w:eastAsia="Times New Roman" w:cs="Times New Roman"/>
-                  <w:kern w:val="0"/>
-                  <w:sz w:val="22"/>
-                  <w:szCs w:val="22"/>
-                  <w:lang w:eastAsia="es-ES"/>
-                  <w14:ligatures w14:val="none"/>
-                </w:rPr>
-                <w:t>r</w:t>
-              </w:r>
-              <w:r>
-                <w:rPr>
-                  <w:rStyle w:val="Hyperlink"/>
-                  <w:rFonts w:eastAsia="Times New Roman" w:cs="Times New Roman"/>
-                  <w:kern w:val="0"/>
-                  <w:sz w:val="22"/>
-                  <w:szCs w:val="22"/>
-                  <w:lang w:eastAsia="es-ES"/>
-                  <w14:ligatures w14:val="none"/>
-                </w:rPr>
-                <w:t>a</w:t>
-              </w:r>
-              <w:r>
-                <w:rPr>
-                  <w:rStyle w:val="Hyperlink"/>
-                  <w:rFonts w:eastAsia="Times New Roman" w:cs="Times New Roman"/>
-                  <w:kern w:val="0"/>
-                  <w:sz w:val="22"/>
-                  <w:szCs w:val="22"/>
-                  <w:lang w:eastAsia="es-ES"/>
-                  <w14:ligatures w14:val="none"/>
-                </w:rPr>
-                <w:t>7</w:t>
-              </w:r>
-              <w:r>
-                <w:rPr>
-                  <w:rStyle w:val="Hyperlink"/>
-                  <w:rFonts w:eastAsia="Times New Roman" w:cs="Times New Roman"/>
-                  <w:kern w:val="0"/>
-                  <w:sz w:val="22"/>
-                  <w:szCs w:val="22"/>
-                  <w:lang w:eastAsia="es-ES"/>
-                  <w14:ligatures w14:val="none"/>
-                </w:rPr>
-                <w:t>@gmail.com</w:t>
+                <w:t>norviscabrera7@gmail.com</w:t>
               </w:r>
             </w:hyperlink>
           </w:p>
@@ -640,33 +604,7 @@
                 <w:lang w:eastAsia="es-ES"/>
                 <w14:ligatures w14:val="none"/>
               </w:rPr>
-              <w:t xml:space="preserve"> utilizando Java Spring </w:t>
-            </w:r>
-            <w:proofErr w:type="spellStart"/>
-            <w:r>
-              <w:rPr>
-                <w:rFonts w:ascii="Times New Roman" w:eastAsia="Times New Roman" w:hAnsi="Times New Roman" w:cs="Times New Roman"/>
-                <w:color w:val="000000"/>
-                <w:kern w:val="0"/>
-                <w:sz w:val="22"/>
-                <w:szCs w:val="22"/>
-                <w:lang w:eastAsia="es-ES"/>
-                <w14:ligatures w14:val="none"/>
-              </w:rPr>
-              <w:t>Boot</w:t>
-            </w:r>
-            <w:proofErr w:type="spellEnd"/>
-            <w:r>
-              <w:rPr>
-                <w:rFonts w:ascii="Times New Roman" w:eastAsia="Times New Roman" w:hAnsi="Times New Roman" w:cs="Times New Roman"/>
-                <w:color w:val="000000"/>
-                <w:kern w:val="0"/>
-                <w:sz w:val="22"/>
-                <w:szCs w:val="22"/>
-                <w:lang w:eastAsia="es-ES"/>
-                <w14:ligatures w14:val="none"/>
-              </w:rPr>
-              <w:t xml:space="preserve"> y </w:t>
+              <w:t xml:space="preserve"> utilizando Java Spring Boot y </w:t>
             </w:r>
             <w:proofErr w:type="spellStart"/>
             <w:r>
@@ -756,33 +694,7 @@
                 <w:lang w:eastAsia="es-ES"/>
                 <w14:ligatures w14:val="none"/>
               </w:rPr>
-              <w:t xml:space="preserve">Realicé análisis de requisitos, pruebas con </w:t>
-            </w:r>
-            <w:proofErr w:type="spellStart"/>
-            <w:r>
-              <w:rPr>
-                <w:rFonts w:ascii="Times New Roman" w:eastAsia="Times New Roman" w:hAnsi="Times New Roman" w:cs="Times New Roman"/>
-                <w:color w:val="000000"/>
-                <w:kern w:val="0"/>
-                <w:sz w:val="22"/>
-                <w:szCs w:val="22"/>
-                <w:lang w:eastAsia="es-ES"/>
-                <w14:ligatures w14:val="none"/>
-              </w:rPr>
-              <w:t>Postman</w:t>
-            </w:r>
-            <w:proofErr w:type="spellEnd"/>
-            <w:r>
-              <w:rPr>
-                <w:rFonts w:ascii="Times New Roman" w:eastAsia="Times New Roman" w:hAnsi="Times New Roman" w:cs="Times New Roman"/>
-                <w:color w:val="000000"/>
-                <w:kern w:val="0"/>
-                <w:sz w:val="22"/>
-                <w:szCs w:val="22"/>
-                <w:lang w:eastAsia="es-ES"/>
-                <w14:ligatures w14:val="none"/>
-              </w:rPr>
-              <w:t xml:space="preserve"> y despliegue del sistema</w:t>
+              <w:t>Realicé análisis de requisitos, pruebas con Postman y despliegue del sistema</w:t>
             </w:r>
             <w:r>
               <w:rPr>
@@ -2138,33 +2050,7 @@
                 <w:lang w:eastAsia="es-ES"/>
                 <w14:ligatures w14:val="none"/>
               </w:rPr>
-              <w:t xml:space="preserve">Herramientas: Git, GitHub, </w:t>
-            </w:r>
-            <w:proofErr w:type="spellStart"/>
-            <w:r>
-              <w:rPr>
-                <w:rFonts w:ascii="Times New Roman" w:eastAsia="Times New Roman" w:hAnsi="Times New Roman" w:cs="Times New Roman"/>
-                <w:color w:val="000000"/>
-                <w:kern w:val="0"/>
-                <w:sz w:val="22"/>
-                <w:szCs w:val="22"/>
-                <w:lang w:eastAsia="es-ES"/>
-                <w14:ligatures w14:val="none"/>
-              </w:rPr>
-              <w:t>Postman</w:t>
-            </w:r>
-            <w:proofErr w:type="spellEnd"/>
-            <w:r>
-              <w:rPr>
-                <w:rFonts w:ascii="Times New Roman" w:eastAsia="Times New Roman" w:hAnsi="Times New Roman" w:cs="Times New Roman"/>
-                <w:color w:val="000000"/>
-                <w:kern w:val="0"/>
-                <w:sz w:val="22"/>
-                <w:szCs w:val="22"/>
-                <w:lang w:eastAsia="es-ES"/>
-                <w14:ligatures w14:val="none"/>
-              </w:rPr>
-              <w:t xml:space="preserve">, </w:t>
+              <w:t xml:space="preserve">Herramientas: Git, GitHub, Postman, </w:t>
             </w:r>
             <w:proofErr w:type="spellStart"/>
             <w:r>
@@ -2228,7 +2114,7 @@
 </file>
 
 <file path=word/endnotes.xml><?xml version="1.0" encoding="utf-8"?>
-<w:endnotes xmlns:wpc="http://schemas.microsoft.com/office/word/2010/wordprocessingCanvas" xmlns:cx="http://schemas.microsoft.com/office/drawing/2014/chartex" xmlns:cx1="http://schemas.microsoft.com/office/drawing/2015/9/8/chartex" xmlns:cx2="http://schemas.microsoft.com/office/drawing/2015/10/21/chartex" xmlns:cx3="http://schemas.microsoft.com/office/drawing/2016/5/9/chartex" xmlns:cx4="http://schemas.microsoft.com/office/drawing/2016/5/10/chartex" xmlns:cx5="http://schemas.microsoft.com/office/drawing/2016/5/11/chartex" xmlns:cx6="http://schemas.microsoft.com/office/drawing/2016/5/12/chartex" xmlns:cx7="http://schemas.microsoft.com/office/drawing/2016/5/13/chartex" xmlns:cx8="http://schemas.microsoft.com/office/drawing/2016/5/14/chartex" xmlns:mc="http://schemas.openxmlformats.org/markup-compatibility/2006" xmlns:aink="http://schemas.microsoft.com/office/drawing/2016/ink" xmlns:am3d="http://schemas.microsoft.com/office/drawing/2017/model3d" xmlns:o="urn:schemas-microsoft-com:office:office" xmlns:oel="http://schemas.microsoft.com/office/2019/extlst" xmlns:r="http://schemas.openxmlformats.org/officeDocument/2006/relationships" xmlns:m="http://schemas.openxmlformats.org/officeDocument/2006/math" xmlns:v="urn:schemas-microsoft-com:vml" xmlns:wp14="http://schemas.microsoft.com/office/word/2010/wordprocessingDrawing" xmlns:wp="http://schemas.openxmlformats.org/drawingml/2006/wordprocessingDrawing" xmlns:w10="urn:schemas-microsoft-com:office:word" xmlns:w="http://schemas.openxmlformats.org/wordprocessingml/2006/main" xmlns:w14="http://schemas.microsoft.com/office/word/2010/wordml" xmlns:w15="http://schemas.microsoft.com/office/word/2012/wordml" xmlns:w16cex="http://schemas.microsoft.com/office/word/2018/wordml/cex" xmlns:w16cid="http://schemas.microsoft.com/office/word/2016/wordml/cid" xmlns:w16="http://schemas.microsoft.com/office/word/2018/wordml" xmlns:w16du="http://schemas.microsoft.com/office/word/2023/wordml/word16du" xmlns:w16sdtdh="http://schemas.microsoft.com/office/word/2020/wordml/sdtdatahash" xmlns:w16se="http://schemas.microsoft.com/office/word/2015/wordml/symex" xmlns:wpg="http://schemas.microsoft.com/office/word/2010/wordprocessingGroup" xmlns:wpi="http://schemas.microsoft.com/office/word/2010/wordprocessingInk" xmlns:wne="http://schemas.microsoft.com/office/word/2006/wordml" xmlns:wps="http://schemas.microsoft.com/office/word/2010/wordprocessingShape" mc:Ignorable="w14 w15 w16se w16cid w16 w16cex w16sdtdh w16du wp14">
+<w:endnotes xmlns:wpc="http://schemas.microsoft.com/office/word/2010/wordprocessingCanvas" xmlns:cx="http://schemas.microsoft.com/office/drawing/2014/chartex" xmlns:cx1="http://schemas.microsoft.com/office/drawing/2015/9/8/chartex" xmlns:cx2="http://schemas.microsoft.com/office/drawing/2015/10/21/chartex" xmlns:cx3="http://schemas.microsoft.com/office/drawing/2016/5/9/chartex" xmlns:cx4="http://schemas.microsoft.com/office/drawing/2016/5/10/chartex" xmlns:cx5="http://schemas.microsoft.com/office/drawing/2016/5/11/chartex" xmlns:cx6="http://schemas.microsoft.com/office/drawing/2016/5/12/chartex" xmlns:cx7="http://schemas.microsoft.com/office/drawing/2016/5/13/chartex" xmlns:cx8="http://schemas.microsoft.com/office/drawing/2016/5/14/chartex" xmlns:mc="http://schemas.openxmlformats.org/markup-compatibility/2006" xmlns:aink="http://schemas.microsoft.com/office/drawing/2016/ink" xmlns:am3d="http://schemas.microsoft.com/office/drawing/2017/model3d" xmlns:o="urn:schemas-microsoft-com:office:office" xmlns:oel="http://schemas.microsoft.com/office/2019/extlst" xmlns:r="http://schemas.openxmlformats.org/officeDocument/2006/relationships" xmlns:m="http://schemas.openxmlformats.org/officeDocument/2006/math" xmlns:v="urn:schemas-microsoft-com:vml" xmlns:wp14="http://schemas.microsoft.com/office/word/2010/wordprocessingDrawing" xmlns:wp="http://schemas.openxmlformats.org/drawingml/2006/wordprocessingDrawing" xmlns:w10="urn:schemas-microsoft-com:office:word" xmlns:w="http://schemas.openxmlformats.org/wordprocessingml/2006/main" xmlns:w14="http://schemas.microsoft.com/office/word/2010/wordml" xmlns:w15="http://schemas.microsoft.com/office/word/2012/wordml" xmlns:w16cei="http://schemas.microsoft.com/office/word/2026/wordml/cei" xmlns:w16cex="http://schemas.microsoft.com/office/word/2018/wordml/cex" xmlns:w16cid="http://schemas.microsoft.com/office/word/2016/wordml/cid" xmlns:w16="http://schemas.microsoft.com/office/word/2018/wordml" xmlns:w16du="http://schemas.microsoft.com/office/word/2023/wordml/word16du" xmlns:w16sdtdh="http://schemas.microsoft.com/office/word/2020/wordml/sdtdatahash" xmlns:w16sdtfl="http://schemas.microsoft.com/office/word/2024/wordml/sdtformatlock" xmlns:w16se="http://schemas.microsoft.com/office/word/2015/wordml/symex" xmlns:wpg="http://schemas.microsoft.com/office/word/2010/wordprocessingGroup" xmlns:wpi="http://schemas.microsoft.com/office/word/2010/wordprocessingInk" xmlns:wne="http://schemas.microsoft.com/office/word/2006/wordml" xmlns:wps="http://schemas.microsoft.com/office/word/2010/wordprocessingShape" mc:Ignorable="w14 w15 w16se w16cid w16 w16cex w16sdtdh w16sdtfl w16du wp14">
   <w:endnote w:type="separator" w:id="-1">
     <w:p>
       <w:pPr>
@@ -2253,7 +2139,7 @@
 </file>
 
 <file path=word/footnotes.xml><?xml version="1.0" encoding="utf-8"?>
-<w:footnotes xmlns:wpc="http://schemas.microsoft.com/office/word/2010/wordprocessingCanvas" xmlns:cx="http://schemas.microsoft.com/office/drawing/2014/chartex" xmlns:cx1="http://schemas.microsoft.com/office/drawing/2015/9/8/chartex" xmlns:cx2="http://schemas.microsoft.com/office/drawing/2015/10/21/chartex" xmlns:cx3="http://schemas.microsoft.com/office/drawing/2016/5/9/chartex" xmlns:cx4="http://schemas.microsoft.com/office/drawing/2016/5/10/chartex" xmlns:cx5="http://schemas.microsoft.com/office/drawing/2016/5/11/chartex" xmlns:cx6="http://schemas.microsoft.com/office/drawing/2016/5/12/chartex" xmlns:cx7="http://schemas.microsoft.com/office/drawing/2016/5/13/chartex" xmlns:cx8="http://schemas.microsoft.com/office/drawing/2016/5/14/chartex" xmlns:mc="http://schemas.openxmlformats.org/markup-compatibility/2006" xmlns:aink="http://schemas.microsoft.com/office/drawing/2016/ink" xmlns:am3d="http://schemas.microsoft.com/office/drawing/2017/model3d" xmlns:o="urn:schemas-microsoft-com:office:office" xmlns:oel="http://schemas.microsoft.com/office/2019/extlst" xmlns:r="http://schemas.openxmlformats.org/officeDocument/2006/relationships" xmlns:m="http://schemas.openxmlformats.org/officeDocument/2006/math" xmlns:v="urn:schemas-microsoft-com:vml" xmlns:wp14="http://schemas.microsoft.com/office/word/2010/wordprocessingDrawing" xmlns:wp="http://schemas.openxmlformats.org/drawingml/2006/wordprocessingDrawing" xmlns:w10="urn:schemas-microsoft-com:office:word" xmlns:w="http://schemas.openxmlformats.org/wordprocessingml/2006/main" xmlns:w14="http://schemas.microsoft.com/office/word/2010/wordml" xmlns:w15="http://schemas.microsoft.com/office/word/2012/wordml" xmlns:w16cex="http://schemas.microsoft.com/office/word/2018/wordml/cex" xmlns:w16cid="http://schemas.microsoft.com/office/word/2016/wordml/cid" xmlns:w16="http://schemas.microsoft.com/office/word/2018/wordml" xmlns:w16du="http://schemas.microsoft.com/office/word/2023/wordml/word16du" xmlns:w16sdtdh="http://schemas.microsoft.com/office/word/2020/wordml/sdtdatahash" xmlns:w16se="http://schemas.microsoft.com/office/word/2015/wordml/symex" xmlns:wpg="http://schemas.microsoft.com/office/word/2010/wordprocessingGroup" xmlns:wpi="http://schemas.microsoft.com/office/word/2010/wordprocessingInk" xmlns:wne="http://schemas.microsoft.com/office/word/2006/wordml" xmlns:wps="http://schemas.microsoft.com/office/word/2010/wordprocessingShape" mc:Ignorable="w14 w15 w16se w16cid w16 w16cex w16sdtdh w16du wp14">
+<w:footnotes xmlns:wpc="http://schemas.microsoft.com/office/word/2010/wordprocessingCanvas" xmlns:cx="http://schemas.microsoft.com/office/drawing/2014/chartex" xmlns:cx1="http://schemas.microsoft.com/office/drawing/2015/9/8/chartex" xmlns:cx2="http://schemas.microsoft.com/office/drawing/2015/10/21/chartex" xmlns:cx3="http://schemas.microsoft.com/office/drawing/2016/5/9/chartex" xmlns:cx4="http://schemas.microsoft.com/office/drawing/2016/5/10/chartex" xmlns:cx5="http://schemas.microsoft.com/office/drawing/2016/5/11/chartex" xmlns:cx6="http://schemas.microsoft.com/office/drawing/2016/5/12/chartex" xmlns:cx7="http://schemas.microsoft.com/office/drawing/2016/5/13/chartex" xmlns:cx8="http://schemas.microsoft.com/office/drawing/2016/5/14/chartex" xmlns:mc="http://schemas.openxmlformats.org/markup-compatibility/2006" xmlns:aink="http://schemas.microsoft.com/office/drawing/2016/ink" xmlns:am3d="http://schemas.microsoft.com/office/drawing/2017/model3d" xmlns:o="urn:schemas-microsoft-com:office:office" xmlns:oel="http://schemas.microsoft.com/office/2019/extlst" xmlns:r="http://schemas.openxmlformats.org/officeDocument/2006/relationships" xmlns:m="http://schemas.openxmlformats.org/officeDocument/2006/math" xmlns:v="urn:schemas-microsoft-com:vml" xmlns:wp14="http://schemas.microsoft.com/office/word/2010/wordprocessingDrawing" xmlns:wp="http://schemas.openxmlformats.org/drawingml/2006/wordprocessingDrawing" xmlns:w10="urn:schemas-microsoft-com:office:word" xmlns:w="http://schemas.openxmlformats.org/wordprocessingml/2006/main" xmlns:w14="http://schemas.microsoft.com/office/word/2010/wordml" xmlns:w15="http://schemas.microsoft.com/office/word/2012/wordml" xmlns:w16cei="http://schemas.microsoft.com/office/word/2026/wordml/cei" xmlns:w16cex="http://schemas.microsoft.com/office/word/2018/wordml/cex" xmlns:w16cid="http://schemas.microsoft.com/office/word/2016/wordml/cid" xmlns:w16="http://schemas.microsoft.com/office/word/2018/wordml" xmlns:w16du="http://schemas.microsoft.com/office/word/2023/wordml/word16du" xmlns:w16sdtdh="http://schemas.microsoft.com/office/word/2020/wordml/sdtdatahash" xmlns:w16sdtfl="http://schemas.microsoft.com/office/word/2024/wordml/sdtformatlock" xmlns:w16se="http://schemas.microsoft.com/office/word/2015/wordml/symex" xmlns:wpg="http://schemas.microsoft.com/office/word/2010/wordprocessingGroup" xmlns:wpi="http://schemas.microsoft.com/office/word/2010/wordprocessingInk" xmlns:wne="http://schemas.microsoft.com/office/word/2006/wordml" xmlns:wps="http://schemas.microsoft.com/office/word/2010/wordprocessingShape" mc:Ignorable="w14 w15 w16se w16cid w16 w16cex w16sdtdh w16sdtfl w16du wp14">
   <w:footnote w:type="separator" w:id="-1">
     <w:p>
       <w:pPr>
@@ -2278,7 +2164,7 @@
 </file>
 
 <file path=word/numbering.xml><?xml version="1.0" encoding="utf-8"?>
-<w:numbering xmlns:wpc="http://schemas.microsoft.com/office/word/2010/wordprocessingCanvas" xmlns:cx="http://schemas.microsoft.com/office/drawing/2014/chartex" xmlns:cx1="http://schemas.microsoft.com/office/drawing/2015/9/8/chartex" xmlns:cx2="http://schemas.microsoft.com/office/drawing/2015/10/21/chartex" xmlns:cx3="http://schemas.microsoft.com/office/drawing/2016/5/9/chartex" xmlns:cx4="http://schemas.microsoft.com/office/drawing/2016/5/10/chartex" xmlns:cx5="http://schemas.microsoft.com/office/drawing/2016/5/11/chartex" xmlns:cx6="http://schemas.microsoft.com/office/drawing/2016/5/12/chartex" xmlns:cx7="http://schemas.microsoft.com/office/drawing/2016/5/13/chartex" xmlns:cx8="http://schemas.microsoft.com/office/drawing/2016/5/14/chartex" xmlns:mc="http://schemas.openxmlformats.org/markup-compatibility/2006" xmlns:aink="http://schemas.microsoft.com/office/drawing/2016/ink" xmlns:am3d="http://schemas.microsoft.com/office/drawing/2017/model3d" xmlns:o="urn:schemas-microsoft-com:office:office" xmlns:oel="http://schemas.microsoft.com/office/2019/extlst" xmlns:r="http://schemas.openxmlformats.org/officeDocument/2006/relationships" xmlns:m="http://schemas.openxmlformats.org/officeDocument/2006/math" xmlns:v="urn:schemas-microsoft-com:vml" xmlns:wp14="http://schemas.microsoft.com/office/word/2010/wordprocessingDrawing" xmlns:wp="http://schemas.openxmlformats.org/drawingml/2006/wordprocessingDrawing" xmlns:w10="urn:schemas-microsoft-com:office:word" xmlns:w="http://schemas.openxmlformats.org/wordprocessingml/2006/main" xmlns:w14="http://schemas.microsoft.com/office/word/2010/wordml" xmlns:w15="http://schemas.microsoft.com/office/word/2012/wordml" xmlns:w16cex="http://schemas.microsoft.com/office/word/2018/wordml/cex" xmlns:w16cid="http://schemas.microsoft.com/office/word/2016/wordml/cid" xmlns:w16="http://schemas.microsoft.com/office/word/2018/wordml" xmlns:w16du="http://schemas.microsoft.com/office/word/2023/wordml/word16du" xmlns:w16sdtdh="http://schemas.microsoft.com/office/word/2020/wordml/sdtdatahash" xmlns:w16se="http://schemas.microsoft.com/office/word/2015/wordml/symex" xmlns:wpg="http://schemas.microsoft.com/office/word/2010/wordprocessingGroup" xmlns:wpi="http://schemas.microsoft.com/office/word/2010/wordprocessingInk" xmlns:wne="http://schemas.microsoft.com/office/word/2006/wordml" xmlns:wps="http://schemas.microsoft.com/office/word/2010/wordprocessingShape" mc:Ignorable="w14 w15 w16se w16cid w16 w16cex w16sdtdh w16du wp14">
+<w:numbering xmlns:wpc="http://schemas.microsoft.com/office/word/2010/wordprocessingCanvas" xmlns:cx="http://schemas.microsoft.com/office/drawing/2014/chartex" xmlns:cx1="http://schemas.microsoft.com/office/drawing/2015/9/8/chartex" xmlns:cx2="http://schemas.microsoft.com/office/drawing/2015/10/21/chartex" xmlns:cx3="http://schemas.microsoft.com/office/drawing/2016/5/9/chartex" xmlns:cx4="http://schemas.microsoft.com/office/drawing/2016/5/10/chartex" xmlns:cx5="http://schemas.microsoft.com/office/drawing/2016/5/11/chartex" xmlns:cx6="http://schemas.microsoft.com/office/drawing/2016/5/12/chartex" xmlns:cx7="http://schemas.microsoft.com/office/drawing/2016/5/13/chartex" xmlns:cx8="http://schemas.microsoft.com/office/drawing/2016/5/14/chartex" xmlns:mc="http://schemas.openxmlformats.org/markup-compatibility/2006" xmlns:aink="http://schemas.microsoft.com/office/drawing/2016/ink" xmlns:am3d="http://schemas.microsoft.com/office/drawing/2017/model3d" xmlns:o="urn:schemas-microsoft-com:office:office" xmlns:oel="http://schemas.microsoft.com/office/2019/extlst" xmlns:r="http://schemas.openxmlformats.org/officeDocument/2006/relationships" xmlns:m="http://schemas.openxmlformats.org/officeDocument/2006/math" xmlns:v="urn:schemas-microsoft-com:vml" xmlns:wp14="http://schemas.microsoft.com/office/word/2010/wordprocessingDrawing" xmlns:wp="http://schemas.openxmlformats.org/drawingml/2006/wordprocessingDrawing" xmlns:w10="urn:schemas-microsoft-com:office:word" xmlns:w="http://schemas.openxmlformats.org/wordprocessingml/2006/main" xmlns:w14="http://schemas.microsoft.com/office/word/2010/wordml" xmlns:w15="http://schemas.microsoft.com/office/word/2012/wordml" xmlns:w16cei="http://schemas.microsoft.com/office/word/2026/wordml/cei" xmlns:w16cex="http://schemas.microsoft.com/office/word/2018/wordml/cex" xmlns:w16cid="http://schemas.microsoft.com/office/word/2016/wordml/cid" xmlns:w16="http://schemas.microsoft.com/office/word/2018/wordml" xmlns:w16du="http://schemas.microsoft.com/office/word/2023/wordml/word16du" xmlns:w16sdtdh="http://schemas.microsoft.com/office/word/2020/wordml/sdtdatahash" xmlns:w16sdtfl="http://schemas.microsoft.com/office/word/2024/wordml/sdtformatlock" xmlns:w16se="http://schemas.microsoft.com/office/word/2015/wordml/symex" xmlns:wpg="http://schemas.microsoft.com/office/word/2010/wordprocessingGroup" xmlns:wpi="http://schemas.microsoft.com/office/word/2010/wordprocessingInk" xmlns:wne="http://schemas.microsoft.com/office/word/2006/wordml" xmlns:wps="http://schemas.microsoft.com/office/word/2010/wordprocessingShape" mc:Ignorable="w14 w15 w16se w16cid w16 w16cex w16sdtdh w16sdtfl w16du wp14">
   <w:abstractNum w:abstractNumId="0" w15:restartNumberingAfterBreak="0">
     <w:nsid w:val="0C787B1A"/>
     <w:multiLevelType w:val="multilevel"/>
@@ -3499,7 +3385,7 @@
 </file>
 
 <file path=word/styles.xml><?xml version="1.0" encoding="utf-8"?>
-<w:styles xmlns:mc="http://schemas.openxmlformats.org/markup-compatibility/2006" xmlns:r="http://schemas.openxmlformats.org/officeDocument/2006/relationships" xmlns:w="http://schemas.openxmlformats.org/wordprocessingml/2006/main" xmlns:w14="http://schemas.microsoft.com/office/word/2010/wordml" xmlns:w15="http://schemas.microsoft.com/office/word/2012/wordml" xmlns:w16cex="http://schemas.microsoft.com/office/word/2018/wordml/cex" xmlns:w16cid="http://schemas.microsoft.com/office/word/2016/wordml/cid" xmlns:w16="http://schemas.microsoft.com/office/word/2018/wordml" xmlns:w16du="http://schemas.microsoft.com/office/word/2023/wordml/word16du" xmlns:w16sdtdh="http://schemas.microsoft.com/office/word/2020/wordml/sdtdatahash" xmlns:w16se="http://schemas.microsoft.com/office/word/2015/wordml/symex" mc:Ignorable="w14 w15 w16se w16cid w16 w16cex w16sdtdh w16du">
+<w:styles xmlns:mc="http://schemas.openxmlformats.org/markup-compatibility/2006" xmlns:r="http://schemas.openxmlformats.org/officeDocument/2006/relationships" xmlns:w="http://schemas.openxmlformats.org/wordprocessingml/2006/main" xmlns:w14="http://schemas.microsoft.com/office/word/2010/wordml" xmlns:w15="http://schemas.microsoft.com/office/word/2012/wordml" xmlns:w16cex="http://schemas.microsoft.com/office/word/2018/wordml/cex" xmlns:w16cid="http://schemas.microsoft.com/office/word/2016/wordml/cid" xmlns:w16="http://schemas.microsoft.com/office/word/2018/wordml" xmlns:w16du="http://schemas.microsoft.com/office/word/2023/wordml/word16du" xmlns:w16sdtdh="http://schemas.microsoft.com/office/word/2020/wordml/sdtdatahash" xmlns:w16sdtfl="http://schemas.microsoft.com/office/word/2024/wordml/sdtformatlock" xmlns:w16se="http://schemas.microsoft.com/office/word/2015/wordml/symex" mc:Ignorable="w14 w15 w16se w16cid w16 w16cex w16sdtdh w16sdtfl w16du">
   <w:docDefaults>
     <w:rPrDefault>
       <w:rPr>

</xml_diff>